<commit_message>
first scripts for benchmark
</commit_message>
<xml_diff>
--- a/Phase 2 - Research/Requirements Benchmarking.docx
+++ b/Phase 2 - Research/Requirements Benchmarking.docx
@@ -7,7 +7,7 @@
         <w:pStyle w:val="Heading1"/>
         <w:jc w:val="center"/>
       </w:pPr>
-      <w:bookmarkStart w:id="0" w:name="_Toc242357290"/>
+      <w:bookmarkStart w:id="0" w:name="_Toc242357973"/>
       <w:r>
         <w:t>Benchmark Requirements/Metrics</w:t>
       </w:r>
@@ -38,6 +38,15 @@
     </w:p>
     <w:sdt>
       <w:sdtPr>
+        <w:rPr>
+          <w:rFonts w:asciiTheme="minorHAnsi" w:eastAsiaTheme="minorEastAsia" w:hAnsiTheme="minorHAnsi" w:cstheme="minorBidi"/>
+          <w:color w:val="auto"/>
+          <w:kern w:val="2"/>
+          <w:sz w:val="24"/>
+          <w:szCs w:val="24"/>
+          <w:lang w:eastAsia="zh-CN"/>
+          <w14:ligatures w14:val="standardContextual"/>
+        </w:rPr>
         <w:id w:val="1155258721"/>
         <w:docPartObj>
           <w:docPartGallery w:val="Table of Contents"/>
@@ -46,16 +55,9 @@
       </w:sdtPr>
       <w:sdtEndPr>
         <w:rPr>
-          <w:rFonts w:asciiTheme="minorHAnsi" w:eastAsiaTheme="minorEastAsia" w:hAnsiTheme="minorHAnsi" w:cstheme="minorBidi"/>
           <w:b/>
           <w:bCs/>
           <w:noProof/>
-          <w:color w:val="auto"/>
-          <w:kern w:val="2"/>
-          <w:sz w:val="24"/>
-          <w:szCs w:val="24"/>
-          <w:lang w:eastAsia="zh-CN"/>
-          <w14:ligatures w14:val="standardContextual"/>
         </w:rPr>
       </w:sdtEndPr>
       <w:sdtContent>
@@ -86,7 +88,7 @@
           <w:r>
             <w:fldChar w:fldCharType="separate"/>
           </w:r>
-          <w:hyperlink w:anchor="_Toc242357290" w:history="1">
+          <w:hyperlink w:anchor="_Toc242357973" w:history="1">
             <w:r>
               <w:rPr>
                 <w:rStyle w:val="Hyperlink"/>
@@ -113,7 +115,7 @@
                 <w:noProof/>
                 <w:webHidden/>
               </w:rPr>
-              <w:instrText xml:space="preserve"> PAGEREF _Toc242357290 \h </w:instrText>
+              <w:instrText xml:space="preserve"> PAGEREF _Toc242357973 \h </w:instrText>
             </w:r>
             <w:r>
               <w:rPr>
@@ -134,74 +136,6 @@
                 <w:webHidden/>
               </w:rPr>
               <w:t>1</w:t>
-            </w:r>
-            <w:r>
-              <w:rPr>
-                <w:noProof/>
-                <w:webHidden/>
-              </w:rPr>
-              <w:fldChar w:fldCharType="end"/>
-            </w:r>
-          </w:hyperlink>
-        </w:p>
-        <w:p>
-          <w:pPr>
-            <w:pStyle w:val="TOC1"/>
-            <w:tabs>
-              <w:tab w:val="right" w:leader="dot" w:pos="9350"/>
-            </w:tabs>
-            <w:rPr>
-              <w:noProof/>
-            </w:rPr>
-          </w:pPr>
-          <w:hyperlink w:anchor="_Toc242357291" w:history="1">
-            <w:r>
-              <w:rPr>
-                <w:rStyle w:val="Hyperlink"/>
-                <w:noProof/>
-              </w:rPr>
-              <w:t>Benchmark Requirements/Metrics</w:t>
-            </w:r>
-            <w:r>
-              <w:rPr>
-                <w:noProof/>
-                <w:webHidden/>
-              </w:rPr>
-              <w:tab/>
-            </w:r>
-            <w:r>
-              <w:rPr>
-                <w:noProof/>
-                <w:webHidden/>
-              </w:rPr>
-              <w:fldChar w:fldCharType="begin"/>
-            </w:r>
-            <w:r>
-              <w:rPr>
-                <w:noProof/>
-                <w:webHidden/>
-              </w:rPr>
-              <w:instrText xml:space="preserve"> PAGEREF _Toc242357291 \h </w:instrText>
-            </w:r>
-            <w:r>
-              <w:rPr>
-                <w:noProof/>
-                <w:webHidden/>
-              </w:rPr>
-            </w:r>
-            <w:r>
-              <w:rPr>
-                <w:noProof/>
-                <w:webHidden/>
-              </w:rPr>
-              <w:fldChar w:fldCharType="separate"/>
-            </w:r>
-            <w:r>
-              <w:rPr>
-                <w:noProof/>
-                <w:webHidden/>
-              </w:rPr>
-              <w:t>3</w:t>
             </w:r>
             <w:r>
               <w:rPr>
@@ -222,7 +156,7 @@
               <w:noProof/>
             </w:rPr>
           </w:pPr>
-          <w:hyperlink w:anchor="_Toc242357292" w:history="1">
+          <w:hyperlink w:anchor="_Toc242357974" w:history="1">
             <w:r>
               <w:rPr>
                 <w:rStyle w:val="Hyperlink"/>
@@ -249,7 +183,7 @@
                 <w:noProof/>
                 <w:webHidden/>
               </w:rPr>
-              <w:instrText xml:space="preserve"> PAGEREF _Toc242357292 \h </w:instrText>
+              <w:instrText xml:space="preserve"> PAGEREF _Toc242357974 \h </w:instrText>
             </w:r>
             <w:r>
               <w:rPr>
@@ -290,7 +224,7 @@
               <w:noProof/>
             </w:rPr>
           </w:pPr>
-          <w:hyperlink w:anchor="_Toc242357293" w:history="1">
+          <w:hyperlink w:anchor="_Toc242357975" w:history="1">
             <w:r>
               <w:rPr>
                 <w:rStyle w:val="Hyperlink"/>
@@ -317,7 +251,7 @@
                 <w:noProof/>
                 <w:webHidden/>
               </w:rPr>
-              <w:instrText xml:space="preserve"> PAGEREF _Toc242357293 \h </w:instrText>
+              <w:instrText xml:space="preserve"> PAGEREF _Toc242357975 \h </w:instrText>
             </w:r>
             <w:r>
               <w:rPr>
@@ -358,7 +292,7 @@
               <w:noProof/>
             </w:rPr>
           </w:pPr>
-          <w:hyperlink w:anchor="_Toc242357294" w:history="1">
+          <w:hyperlink w:anchor="_Toc242357976" w:history="1">
             <w:r>
               <w:rPr>
                 <w:rStyle w:val="Hyperlink"/>
@@ -385,7 +319,7 @@
                 <w:noProof/>
                 <w:webHidden/>
               </w:rPr>
-              <w:instrText xml:space="preserve"> PAGEREF _Toc242357294 \h </w:instrText>
+              <w:instrText xml:space="preserve"> PAGEREF _Toc242357976 \h </w:instrText>
             </w:r>
             <w:r>
               <w:rPr>
@@ -426,7 +360,7 @@
               <w:noProof/>
             </w:rPr>
           </w:pPr>
-          <w:hyperlink w:anchor="_Toc242357295" w:history="1">
+          <w:hyperlink w:anchor="_Toc242357977" w:history="1">
             <w:r>
               <w:rPr>
                 <w:rStyle w:val="Hyperlink"/>
@@ -455,7 +389,7 @@
                 <w:noProof/>
                 <w:webHidden/>
               </w:rPr>
-              <w:instrText xml:space="preserve"> PAGEREF _Toc242357295 \h </w:instrText>
+              <w:instrText xml:space="preserve"> PAGEREF _Toc242357977 \h </w:instrText>
             </w:r>
             <w:r>
               <w:rPr>
@@ -496,7 +430,7 @@
               <w:noProof/>
             </w:rPr>
           </w:pPr>
-          <w:hyperlink w:anchor="_Toc242357296" w:history="1">
+          <w:hyperlink w:anchor="_Toc242357978" w:history="1">
             <w:r>
               <w:rPr>
                 <w:rStyle w:val="Hyperlink"/>
@@ -525,7 +459,7 @@
                 <w:noProof/>
                 <w:webHidden/>
               </w:rPr>
-              <w:instrText xml:space="preserve"> PAGEREF _Toc242357296 \h </w:instrText>
+              <w:instrText xml:space="preserve"> PAGEREF _Toc242357978 \h </w:instrText>
             </w:r>
             <w:r>
               <w:rPr>
@@ -566,7 +500,7 @@
               <w:noProof/>
             </w:rPr>
           </w:pPr>
-          <w:hyperlink w:anchor="_Toc242357297" w:history="1">
+          <w:hyperlink w:anchor="_Toc242357979" w:history="1">
             <w:r>
               <w:rPr>
                 <w:rStyle w:val="Hyperlink"/>
@@ -593,7 +527,7 @@
                 <w:noProof/>
                 <w:webHidden/>
               </w:rPr>
-              <w:instrText xml:space="preserve"> PAGEREF _Toc242357297 \h </w:instrText>
+              <w:instrText xml:space="preserve"> PAGEREF _Toc242357979 \h </w:instrText>
             </w:r>
             <w:r>
               <w:rPr>
@@ -634,7 +568,7 @@
               <w:noProof/>
             </w:rPr>
           </w:pPr>
-          <w:hyperlink w:anchor="_Toc242357298" w:history="1">
+          <w:hyperlink w:anchor="_Toc242357980" w:history="1">
             <w:r>
               <w:rPr>
                 <w:rStyle w:val="Hyperlink"/>
@@ -661,7 +595,7 @@
                 <w:noProof/>
                 <w:webHidden/>
               </w:rPr>
-              <w:instrText xml:space="preserve"> PAGEREF _Toc242357298 \h </w:instrText>
+              <w:instrText xml:space="preserve"> PAGEREF _Toc242357980 \h </w:instrText>
             </w:r>
             <w:r>
               <w:rPr>
@@ -702,7 +636,7 @@
               <w:noProof/>
             </w:rPr>
           </w:pPr>
-          <w:hyperlink w:anchor="_Toc242357299" w:history="1">
+          <w:hyperlink w:anchor="_Toc242357981" w:history="1">
             <w:r>
               <w:rPr>
                 <w:rStyle w:val="Hyperlink"/>
@@ -729,7 +663,7 @@
                 <w:noProof/>
                 <w:webHidden/>
               </w:rPr>
-              <w:instrText xml:space="preserve"> PAGEREF _Toc242357299 \h </w:instrText>
+              <w:instrText xml:space="preserve"> PAGEREF _Toc242357981 \h </w:instrText>
             </w:r>
             <w:r>
               <w:rPr>
@@ -770,7 +704,7 @@
               <w:noProof/>
             </w:rPr>
           </w:pPr>
-          <w:hyperlink w:anchor="_Toc242357300" w:history="1">
+          <w:hyperlink w:anchor="_Toc242357982" w:history="1">
             <w:r>
               <w:rPr>
                 <w:rStyle w:val="Hyperlink"/>
@@ -797,7 +731,7 @@
                 <w:noProof/>
                 <w:webHidden/>
               </w:rPr>
-              <w:instrText xml:space="preserve"> PAGEREF _Toc242357300 \h </w:instrText>
+              <w:instrText xml:space="preserve"> PAGEREF _Toc242357982 \h </w:instrText>
             </w:r>
             <w:r>
               <w:rPr>
@@ -838,7 +772,7 @@
               <w:noProof/>
             </w:rPr>
           </w:pPr>
-          <w:hyperlink w:anchor="_Toc242357301" w:history="1">
+          <w:hyperlink w:anchor="_Toc242357983" w:history="1">
             <w:r>
               <w:rPr>
                 <w:rStyle w:val="Hyperlink"/>
@@ -865,7 +799,7 @@
                 <w:noProof/>
                 <w:webHidden/>
               </w:rPr>
-              <w:instrText xml:space="preserve"> PAGEREF _Toc242357301 \h </w:instrText>
+              <w:instrText xml:space="preserve"> PAGEREF _Toc242357983 \h </w:instrText>
             </w:r>
             <w:r>
               <w:rPr>
@@ -906,7 +840,7 @@
               <w:noProof/>
             </w:rPr>
           </w:pPr>
-          <w:hyperlink w:anchor="_Toc242357302" w:history="1">
+          <w:hyperlink w:anchor="_Toc242357984" w:history="1">
             <w:r>
               <w:rPr>
                 <w:rStyle w:val="Hyperlink"/>
@@ -933,7 +867,7 @@
                 <w:noProof/>
                 <w:webHidden/>
               </w:rPr>
-              <w:instrText xml:space="preserve"> PAGEREF _Toc242357302 \h </w:instrText>
+              <w:instrText xml:space="preserve"> PAGEREF _Toc242357984 \h </w:instrText>
             </w:r>
             <w:r>
               <w:rPr>
@@ -974,7 +908,7 @@
               <w:noProof/>
             </w:rPr>
           </w:pPr>
-          <w:hyperlink w:anchor="_Toc242357303" w:history="1">
+          <w:hyperlink w:anchor="_Toc242357985" w:history="1">
             <w:r>
               <w:rPr>
                 <w:rStyle w:val="Hyperlink"/>
@@ -1001,7 +935,7 @@
                 <w:noProof/>
                 <w:webHidden/>
               </w:rPr>
-              <w:instrText xml:space="preserve"> PAGEREF _Toc242357303 \h </w:instrText>
+              <w:instrText xml:space="preserve"> PAGEREF _Toc242357985 \h </w:instrText>
             </w:r>
             <w:r>
               <w:rPr>
@@ -1042,7 +976,7 @@
               <w:noProof/>
             </w:rPr>
           </w:pPr>
-          <w:hyperlink w:anchor="_Toc242357304" w:history="1">
+          <w:hyperlink w:anchor="_Toc242357986" w:history="1">
             <w:r>
               <w:rPr>
                 <w:rStyle w:val="Hyperlink"/>
@@ -1069,7 +1003,7 @@
                 <w:noProof/>
                 <w:webHidden/>
               </w:rPr>
-              <w:instrText xml:space="preserve"> PAGEREF _Toc242357304 \h </w:instrText>
+              <w:instrText xml:space="preserve"> PAGEREF _Toc242357986 \h </w:instrText>
             </w:r>
             <w:r>
               <w:rPr>
@@ -1110,7 +1044,7 @@
               <w:noProof/>
             </w:rPr>
           </w:pPr>
-          <w:hyperlink w:anchor="_Toc242357305" w:history="1">
+          <w:hyperlink w:anchor="_Toc242357987" w:history="1">
             <w:r>
               <w:rPr>
                 <w:rStyle w:val="Hyperlink"/>
@@ -1137,7 +1071,7 @@
                 <w:noProof/>
                 <w:webHidden/>
               </w:rPr>
-              <w:instrText xml:space="preserve"> PAGEREF _Toc242357305 \h </w:instrText>
+              <w:instrText xml:space="preserve"> PAGEREF _Toc242357987 \h </w:instrText>
             </w:r>
             <w:r>
               <w:rPr>
@@ -1178,7 +1112,7 @@
               <w:noProof/>
             </w:rPr>
           </w:pPr>
-          <w:hyperlink w:anchor="_Toc242357306" w:history="1">
+          <w:hyperlink w:anchor="_Toc242357988" w:history="1">
             <w:r>
               <w:rPr>
                 <w:rStyle w:val="Hyperlink"/>
@@ -1205,7 +1139,7 @@
                 <w:noProof/>
                 <w:webHidden/>
               </w:rPr>
-              <w:instrText xml:space="preserve"> PAGEREF _Toc242357306 \h </w:instrText>
+              <w:instrText xml:space="preserve"> PAGEREF _Toc242357988 \h </w:instrText>
             </w:r>
             <w:r>
               <w:rPr>
@@ -1246,7 +1180,7 @@
               <w:noProof/>
             </w:rPr>
           </w:pPr>
-          <w:hyperlink w:anchor="_Toc242357307" w:history="1">
+          <w:hyperlink w:anchor="_Toc242357989" w:history="1">
             <w:r>
               <w:rPr>
                 <w:rStyle w:val="Hyperlink"/>
@@ -1273,7 +1207,7 @@
                 <w:noProof/>
                 <w:webHidden/>
               </w:rPr>
-              <w:instrText xml:space="preserve"> PAGEREF _Toc242357307 \h </w:instrText>
+              <w:instrText xml:space="preserve"> PAGEREF _Toc242357989 \h </w:instrText>
             </w:r>
             <w:r>
               <w:rPr>
@@ -1314,7 +1248,7 @@
               <w:noProof/>
             </w:rPr>
           </w:pPr>
-          <w:hyperlink w:anchor="_Toc242357308" w:history="1">
+          <w:hyperlink w:anchor="_Toc242357990" w:history="1">
             <w:r>
               <w:rPr>
                 <w:rStyle w:val="Hyperlink"/>
@@ -1341,7 +1275,7 @@
                 <w:noProof/>
                 <w:webHidden/>
               </w:rPr>
-              <w:instrText xml:space="preserve"> PAGEREF _Toc242357308 \h </w:instrText>
+              <w:instrText xml:space="preserve"> PAGEREF _Toc242357990 \h </w:instrText>
             </w:r>
             <w:r>
               <w:rPr>
@@ -1382,7 +1316,7 @@
               <w:noProof/>
             </w:rPr>
           </w:pPr>
-          <w:hyperlink w:anchor="_Toc242357309" w:history="1">
+          <w:hyperlink w:anchor="_Toc242357991" w:history="1">
             <w:r>
               <w:rPr>
                 <w:rStyle w:val="Hyperlink"/>
@@ -1409,7 +1343,7 @@
                 <w:noProof/>
                 <w:webHidden/>
               </w:rPr>
-              <w:instrText xml:space="preserve"> PAGEREF _Toc242357309 \h </w:instrText>
+              <w:instrText xml:space="preserve"> PAGEREF _Toc242357991 \h </w:instrText>
             </w:r>
             <w:r>
               <w:rPr>
@@ -1496,7 +1430,7 @@
       <w:pPr>
         <w:pStyle w:val="Heading2"/>
       </w:pPr>
-      <w:bookmarkStart w:id="1" w:name="_Toc242357292"/>
+      <w:bookmarkStart w:id="1" w:name="_Toc242357974"/>
       <w:r>
         <w:lastRenderedPageBreak/>
         <w:t>Purpose</w:t>
@@ -1539,7 +1473,7 @@
       <w:pPr>
         <w:pStyle w:val="Heading2"/>
       </w:pPr>
-      <w:bookmarkStart w:id="2" w:name="_Toc242357293"/>
+      <w:bookmarkStart w:id="2" w:name="_Toc242357975"/>
       <w:r>
         <w:t>Scope</w:t>
       </w:r>
@@ -1619,7 +1553,7 @@
       <w:pPr>
         <w:pStyle w:val="Heading2"/>
       </w:pPr>
-      <w:bookmarkStart w:id="3" w:name="_Toc242357294"/>
+      <w:bookmarkStart w:id="3" w:name="_Toc242357976"/>
       <w:r>
         <w:t>Research Objective</w:t>
       </w:r>
@@ -1807,7 +1741,7 @@
           <w:rStyle w:val="Strong"/>
         </w:rPr>
       </w:pPr>
-      <w:bookmarkStart w:id="4" w:name="_Toc242357295"/>
+      <w:bookmarkStart w:id="4" w:name="_Toc242357977"/>
       <w:r>
         <w:rPr>
           <w:rStyle w:val="Strong"/>
@@ -2134,10 +2068,7 @@
               <w:jc w:val="center"/>
             </w:pPr>
             <w:r>
-              <w:t>FR-0</w:t>
-            </w:r>
-            <w:r>
-              <w:t>6</w:t>
+              <w:t>FR-06</w:t>
             </w:r>
           </w:p>
         </w:tc>
@@ -2183,10 +2114,7 @@
               <w:jc w:val="center"/>
             </w:pPr>
             <w:r>
-              <w:t>FR-0</w:t>
-            </w:r>
-            <w:r>
-              <w:t>7</w:t>
+              <w:t>FR-07</w:t>
             </w:r>
           </w:p>
         </w:tc>
@@ -2232,10 +2160,7 @@
               <w:jc w:val="center"/>
             </w:pPr>
             <w:r>
-              <w:t>FR-0</w:t>
-            </w:r>
-            <w:r>
-              <w:t>8</w:t>
+              <w:t>FR-08</w:t>
             </w:r>
           </w:p>
         </w:tc>
@@ -2281,10 +2206,7 @@
               <w:jc w:val="center"/>
             </w:pPr>
             <w:r>
-              <w:t>FR-0</w:t>
-            </w:r>
-            <w:r>
-              <w:t>9</w:t>
+              <w:t>FR-09</w:t>
             </w:r>
           </w:p>
         </w:tc>
@@ -2330,10 +2252,7 @@
               <w:jc w:val="center"/>
             </w:pPr>
             <w:r>
-              <w:t>FR-</w:t>
-            </w:r>
-            <w:r>
-              <w:t>10</w:t>
+              <w:t>FR-10</w:t>
             </w:r>
           </w:p>
         </w:tc>
@@ -2382,10 +2301,7 @@
               <w:jc w:val="center"/>
             </w:pPr>
             <w:r>
-              <w:t>FR-</w:t>
-            </w:r>
-            <w:r>
-              <w:t>11</w:t>
+              <w:t>FR-11</w:t>
             </w:r>
           </w:p>
         </w:tc>
@@ -2432,10 +2348,7 @@
             </w:pPr>
             <w:r>
               <w:lastRenderedPageBreak/>
-              <w:t>FR-</w:t>
-            </w:r>
-            <w:r>
-              <w:t>12</w:t>
+              <w:t>FR-12</w:t>
             </w:r>
           </w:p>
         </w:tc>
@@ -2490,10 +2403,7 @@
               <w:jc w:val="center"/>
             </w:pPr>
             <w:r>
-              <w:t>FR-</w:t>
-            </w:r>
-            <w:r>
-              <w:t>13</w:t>
+              <w:t>FR-13</w:t>
             </w:r>
           </w:p>
         </w:tc>
@@ -2778,7 +2688,7 @@
         <w:lastRenderedPageBreak/>
         <w:t xml:space="preserve"> </w:t>
       </w:r>
-      <w:bookmarkStart w:id="5" w:name="_Toc242357296"/>
+      <w:bookmarkStart w:id="5" w:name="_Toc242357978"/>
       <w:r>
         <w:rPr>
           <w:rStyle w:val="Strong"/>
@@ -3352,7 +3262,7 @@
       <w:pPr>
         <w:pStyle w:val="Heading2"/>
       </w:pPr>
-      <w:bookmarkStart w:id="6" w:name="_Toc242357297"/>
+      <w:bookmarkStart w:id="6" w:name="_Toc242357979"/>
       <w:r>
         <w:t>Common / Base Metrics</w:t>
       </w:r>
@@ -4705,7 +4615,7 @@
       <w:pPr>
         <w:pStyle w:val="Heading2"/>
       </w:pPr>
-      <w:bookmarkStart w:id="7" w:name="_Toc242357298"/>
+      <w:bookmarkStart w:id="7" w:name="_Toc242357980"/>
       <w:r>
         <w:t>Use-Case based Metrics</w:t>
       </w:r>
@@ -4718,7 +4628,7 @@
           <w:tab w:val="left" w:pos="2775"/>
         </w:tabs>
       </w:pPr>
-      <w:bookmarkStart w:id="8" w:name="_Toc242357299"/>
+      <w:bookmarkStart w:id="8" w:name="_Toc242357981"/>
       <w:r>
         <w:t>Chat / General LLM</w:t>
       </w:r>
@@ -5355,7 +5265,7 @@
       <w:pPr>
         <w:pStyle w:val="Heading3"/>
       </w:pPr>
-      <w:bookmarkStart w:id="9" w:name="_Toc242357300"/>
+      <w:bookmarkStart w:id="9" w:name="_Toc242357982"/>
       <w:r>
         <w:t>RAG</w:t>
       </w:r>
@@ -5465,10 +5375,7 @@
               <w:ind w:left="0"/>
             </w:pPr>
             <w:r>
-              <w:t>Recall</w:t>
-            </w:r>
-            <w:r>
-              <w:t>-Top-K-Results</w:t>
+              <w:t>Recall-Top-K-Results</w:t>
             </w:r>
           </w:p>
         </w:tc>
@@ -5526,10 +5433,7 @@
               <w:ind w:left="0"/>
             </w:pPr>
             <w:r>
-              <w:t>Precision</w:t>
-            </w:r>
-            <w:r>
-              <w:t>-Top-K-Results</w:t>
+              <w:t>Precision-Top-K-Results</w:t>
             </w:r>
           </w:p>
         </w:tc>
@@ -6141,7 +6045,7 @@
       <w:pPr>
         <w:pStyle w:val="Heading3"/>
       </w:pPr>
-      <w:bookmarkStart w:id="10" w:name="_Toc242357301"/>
+      <w:bookmarkStart w:id="10" w:name="_Toc242357983"/>
       <w:r>
         <w:t>Classification</w:t>
       </w:r>
@@ -6595,7 +6499,7 @@
       <w:pPr>
         <w:pStyle w:val="Heading3"/>
       </w:pPr>
-      <w:bookmarkStart w:id="11" w:name="_Toc242357302"/>
+      <w:bookmarkStart w:id="11" w:name="_Toc242357984"/>
       <w:r>
         <w:t>Agentic Tool-Use/Workflows</w:t>
       </w:r>
@@ -7088,7 +6992,7 @@
         <w:lastRenderedPageBreak/>
         <w:t xml:space="preserve"> </w:t>
       </w:r>
-      <w:bookmarkStart w:id="12" w:name="_Toc242357303"/>
+      <w:bookmarkStart w:id="12" w:name="_Toc242357985"/>
       <w:r>
         <w:t>Experimental Methodology Requirements</w:t>
       </w:r>
@@ -7098,7 +7002,7 @@
       <w:pPr>
         <w:pStyle w:val="Heading3"/>
       </w:pPr>
-      <w:bookmarkStart w:id="13" w:name="_Toc242357304"/>
+      <w:bookmarkStart w:id="13" w:name="_Toc242357986"/>
       <w:r>
         <w:t>Controlled Variables</w:t>
       </w:r>
@@ -7225,7 +7129,7 @@
       <w:pPr>
         <w:pStyle w:val="Heading3"/>
       </w:pPr>
-      <w:bookmarkStart w:id="14" w:name="_Toc242357305"/>
+      <w:bookmarkStart w:id="14" w:name="_Toc242357987"/>
       <w:r>
         <w:t>Benchmark Repetitions</w:t>
       </w:r>
@@ -7259,7 +7163,7 @@
         <w:lastRenderedPageBreak/>
         <w:t xml:space="preserve"> </w:t>
       </w:r>
-      <w:bookmarkStart w:id="15" w:name="_Toc242357306"/>
+      <w:bookmarkStart w:id="15" w:name="_Toc242357988"/>
       <w:r>
         <w:t>Model Selection</w:t>
       </w:r>
@@ -7381,7 +7285,7 @@
       <w:pPr>
         <w:pStyle w:val="Heading3"/>
       </w:pPr>
-      <w:bookmarkStart w:id="16" w:name="_Toc242357307"/>
+      <w:bookmarkStart w:id="16" w:name="_Toc242357989"/>
       <w:r>
         <w:t>Data Storage</w:t>
       </w:r>
@@ -7491,7 +7395,7 @@
       <w:pPr>
         <w:pStyle w:val="Heading3"/>
       </w:pPr>
-      <w:bookmarkStart w:id="17" w:name="_Toc242357308"/>
+      <w:bookmarkStart w:id="17" w:name="_Toc242357990"/>
       <w:r>
         <w:lastRenderedPageBreak/>
         <w:t>Validation</w:t>
@@ -7593,7 +7497,7 @@
       <w:pPr>
         <w:pStyle w:val="Heading2"/>
       </w:pPr>
-      <w:bookmarkStart w:id="18" w:name="_Toc242357309"/>
+      <w:bookmarkStart w:id="18" w:name="_Toc242357991"/>
       <w:r>
         <w:lastRenderedPageBreak/>
         <w:t>Feasibility Assessment</w:t>
@@ -9328,6 +9232,7 @@
   <w:style w:type="character" w:default="1" w:styleId="DefaultParagraphFont">
     <w:name w:val="Default Paragraph Font"/>
     <w:uiPriority w:val="1"/>
+    <w:semiHidden/>
     <w:unhideWhenUsed/>
   </w:style>
   <w:style w:type="table" w:default="1" w:styleId="TableNormal">

</xml_diff>